<commit_message>
Report in log2 units; add survivorship-difference panel to Figure 2
- The Gompertz law is now reported as h(t) = R0 * 2^(t / MRDT): Fig 1
  has a log2 axis (one gridline per doubling), Fig 4 shows R0 on a
  log2 axis, and the tables give log2R0 and the hazard ratio in
  doublings (HF is 0.50 doublings above CD). Fitting is unchanged.
- Figure 2b: mean age at death of each diet's survivors by T-age,
  relative to both diets, with s.e.m. bands and Gompertz predictions
  (after Arends et al. 2026 Fig. 1b). The diet gap holds at about
  65-69 d through 400 d, then closes between 650 and 850 d, faster
  than the Gompertz fits predict.
- Overview, legends and notes updated.

Co-Authored-By: Claude Opus 5.5 <noreply@anthropic.com>
Claude-Session: https://claude.ai/code/session_01LjVRTysfiRrxMNqEy9eJRa
</commit_message>
<xml_diff>
--- a/notes/Overview_MRDT_diet_initial.docx
+++ b/notes/Overview_MRDT_diet_initial.docx
@@ -44,7 +44,7 @@
           <w:sz w:val="21"/>
           <w:szCs w:val="21"/>
         </w:rPr>
-        <w:t xml:space="preserve">Code and outputs: github.com/robwwilliams/bxd_mortality_rates_2026, folders Gompertz/ and output/. Read with Figures 1 to 4; legends are in section 8.</w:t>
+        <w:t xml:space="preserve">Code and outputs: github.com/robwwilliams/bxd_mortality_rates_2026, folders Gompertz/ and output/ Read with Figures 1 to 4; legends are in section 8.</w:t>
       </w:r>
     </w:p>
     <w:p>
@@ -784,7 +784,7 @@
           <w:sz w:val="21"/>
           <w:szCs w:val="21"/>
         </w:rPr>
-        <w:t xml:space="preserve">The Gompertz hazard at age </w:t>
+        <w:t xml:space="preserve">We write the Gompertz law in base 2, so its parameters read directly. The hazard at age </w:t>
       </w:r>
       <w:r>
         <w:rPr>
@@ -844,7 +844,37 @@
           <w:sz w:val="21"/>
           <w:szCs w:val="21"/>
         </w:rPr>
-        <w:t xml:space="preserve">) = </w:t>
+        <w:t xml:space="preserve">) = R0 · 2</w:t>
+      </w:r>
+      <w:r>
+        <w:rPr>
+          <w:rFonts w:ascii="Calibri" w:cs="Calibri" w:eastAsia="Calibri" w:hAnsi="Calibri"/>
+          <w:sz w:val="21"/>
+          <w:szCs w:val="21"/>
+          <w:vertAlign w:val="superscript"/>
+        </w:rPr>
+        <w:t xml:space="preserve">*t* / MRDT</w:t>
+      </w:r>
+      <w:r>
+        <w:rPr>
+          <w:rFonts w:ascii="Calibri" w:cs="Calibri" w:eastAsia="Calibri" w:hAnsi="Calibri"/>
+          <w:sz w:val="21"/>
+          <w:szCs w:val="21"/>
+        </w:rPr>
+        <w:t xml:space="preserve">,</w:t>
+      </w:r>
+    </w:p>
+    <w:p>
+      <w:pPr>
+        <w:spacing w:after="100"/>
+      </w:pPr>
+      <w:r>
+        <w:rPr>
+          <w:rFonts w:ascii="Calibri" w:cs="Calibri" w:eastAsia="Calibri" w:hAnsi="Calibri"/>
+          <w:sz w:val="21"/>
+          <w:szCs w:val="21"/>
+        </w:rPr>
+        <w:t xml:space="preserve">where R0 is the mortality rate extrapolated to age 0 (per day), and mortality doubles every MRDT days. This is the same law as </w:t>
       </w:r>
       <w:r>
         <w:rPr>
@@ -854,15 +884,15 @@
           <w:sz w:val="21"/>
           <w:szCs w:val="21"/>
         </w:rPr>
-        <w:t xml:space="preserve">a</w:t>
-      </w:r>
-      <w:r>
-        <w:rPr>
-          <w:rFonts w:ascii="Calibri" w:cs="Calibri" w:eastAsia="Calibri" w:hAnsi="Calibri"/>
-          <w:sz w:val="21"/>
-          <w:szCs w:val="21"/>
-        </w:rPr>
-        <w:t xml:space="preserve"> e</w:t>
+        <w:t xml:space="preserve">h</w:t>
+      </w:r>
+      <w:r>
+        <w:rPr>
+          <w:rFonts w:ascii="Calibri" w:cs="Calibri" w:eastAsia="Calibri" w:hAnsi="Calibri"/>
+          <w:sz w:val="21"/>
+          <w:szCs w:val="21"/>
+        </w:rPr>
+        <w:t xml:space="preserve">(</w:t>
       </w:r>
       <w:r>
         <w:rPr>
@@ -871,17 +901,16 @@
           <w:iCs/>
           <w:sz w:val="21"/>
           <w:szCs w:val="21"/>
-          <w:vertAlign w:val="superscript"/>
-        </w:rPr>
-        <w:t xml:space="preserve">bt</w:t>
-      </w:r>
-      <w:r>
-        <w:rPr>
-          <w:rFonts w:ascii="Calibri" w:cs="Calibri" w:eastAsia="Calibri" w:hAnsi="Calibri"/>
-          <w:sz w:val="21"/>
-          <w:szCs w:val="21"/>
-        </w:rPr>
-        <w:t xml:space="preserve">,   MRDT = ln 2 / </w:t>
+        </w:rPr>
+        <w:t xml:space="preserve">t</w:t>
+      </w:r>
+      <w:r>
+        <w:rPr>
+          <w:rFonts w:ascii="Calibri" w:cs="Calibri" w:eastAsia="Calibri" w:hAnsi="Calibri"/>
+          <w:sz w:val="21"/>
+          <w:szCs w:val="21"/>
+        </w:rPr>
+        <w:t xml:space="preserve">) = </w:t>
       </w:r>
       <w:r>
         <w:rPr>
@@ -891,28 +920,15 @@
           <w:sz w:val="21"/>
           <w:szCs w:val="21"/>
         </w:rPr>
-        <w:t xml:space="preserve">b</w:t>
-      </w:r>
-      <w:r>
-        <w:rPr>
-          <w:rFonts w:ascii="Calibri" w:cs="Calibri" w:eastAsia="Calibri" w:hAnsi="Calibri"/>
-          <w:sz w:val="21"/>
-          <w:szCs w:val="21"/>
-        </w:rPr>
-        <w:t xml:space="preserve">,</w:t>
-      </w:r>
-    </w:p>
-    <w:p>
-      <w:pPr>
-        <w:spacing w:after="100"/>
-      </w:pPr>
-      <w:r>
-        <w:rPr>
-          <w:rFonts w:ascii="Calibri" w:cs="Calibri" w:eastAsia="Calibri" w:hAnsi="Calibri"/>
-          <w:sz w:val="21"/>
-          <w:szCs w:val="21"/>
-        </w:rPr>
-        <w:t xml:space="preserve">where </w:t>
+        <w:t xml:space="preserve">a</w:t>
+      </w:r>
+      <w:r>
+        <w:rPr>
+          <w:rFonts w:ascii="Calibri" w:cs="Calibri" w:eastAsia="Calibri" w:hAnsi="Calibri"/>
+          <w:sz w:val="21"/>
+          <w:szCs w:val="21"/>
+        </w:rPr>
+        <w:t xml:space="preserve"> e</w:t>
       </w:r>
       <w:r>
         <w:rPr>
@@ -921,16 +937,17 @@
           <w:iCs/>
           <w:sz w:val="21"/>
           <w:szCs w:val="21"/>
-        </w:rPr>
-        <w:t xml:space="preserve">a</w:t>
-      </w:r>
-      <w:r>
-        <w:rPr>
-          <w:rFonts w:ascii="Calibri" w:cs="Calibri" w:eastAsia="Calibri" w:hAnsi="Calibri"/>
-          <w:sz w:val="21"/>
-          <w:szCs w:val="21"/>
-        </w:rPr>
-        <w:t xml:space="preserve"> is R0, the mortality rate extrapolated to age 0 (per day), and </w:t>
+          <w:vertAlign w:val="superscript"/>
+        </w:rPr>
+        <w:t xml:space="preserve">bt</w:t>
+      </w:r>
+      <w:r>
+        <w:rPr>
+          <w:rFonts w:ascii="Calibri" w:cs="Calibri" w:eastAsia="Calibri" w:hAnsi="Calibri"/>
+          <w:sz w:val="21"/>
+          <w:szCs w:val="21"/>
+        </w:rPr>
+        <w:t xml:space="preserve"> with </w:t>
       </w:r>
       <w:r>
         <w:rPr>
@@ -940,6 +957,24 @@
           <w:sz w:val="21"/>
           <w:szCs w:val="21"/>
         </w:rPr>
+        <w:t xml:space="preserve">a</w:t>
+      </w:r>
+      <w:r>
+        <w:rPr>
+          <w:rFonts w:ascii="Calibri" w:cs="Calibri" w:eastAsia="Calibri" w:hAnsi="Calibri"/>
+          <w:sz w:val="21"/>
+          <w:szCs w:val="21"/>
+        </w:rPr>
+        <w:t xml:space="preserve"> = R0 and </w:t>
+      </w:r>
+      <w:r>
+        <w:rPr>
+          <w:rFonts w:ascii="Calibri" w:cs="Calibri" w:eastAsia="Calibri" w:hAnsi="Calibri"/>
+          <w:i/>
+          <w:iCs/>
+          <w:sz w:val="21"/>
+          <w:szCs w:val="21"/>
+        </w:rPr>
         <w:t xml:space="preserve">b</w:t>
       </w:r>
       <w:r>
@@ -948,7 +983,7 @@
           <w:sz w:val="21"/>
           <w:szCs w:val="21"/>
         </w:rPr>
-        <w:t xml:space="preserve"> is the exponential slope. For an animal that enters at age </w:t>
+        <w:t xml:space="preserve"> = ln 2 / MRDT. The fitting code works in that natural-log form, which changes nothing in the results. For an animal that enters at age </w:t>
       </w:r>
       <w:r>
         <w:rPr>
@@ -1761,7 +1796,7 @@
           <w:sz w:val="21"/>
           <w:szCs w:val="21"/>
         </w:rPr>
-        <w:t xml:space="preserve"> with a shared slope, multiplying the hazard by the hazard ratio (HR) is the same as being MRDT × log</w:t>
+        <w:t xml:space="preserve"> with a shared slope, multiplying the hazard by the hazard ratio (HR) is the same as being log</w:t>
       </w:r>
       <w:r>
         <w:rPr>
@@ -1778,7 +1813,52 @@
           <w:sz w:val="21"/>
           <w:szCs w:val="21"/>
         </w:rPr>
-        <w:t xml:space="preserve">(HR) days older.</w:t>
+        <w:t xml:space="preserve">(HR) doublings older, or MRDT × log</w:t>
+      </w:r>
+      <w:r>
+        <w:rPr>
+          <w:rFonts w:ascii="Calibri" w:cs="Calibri" w:eastAsia="Calibri" w:hAnsi="Calibri"/>
+          <w:sz w:val="21"/>
+          <w:szCs w:val="21"/>
+          <w:vertAlign w:val="subscript"/>
+        </w:rPr>
+        <w:t xml:space="preserve">2</w:t>
+      </w:r>
+      <w:r>
+        <w:rPr>
+          <w:rFonts w:ascii="Calibri" w:cs="Calibri" w:eastAsia="Calibri" w:hAnsi="Calibri"/>
+          <w:sz w:val="21"/>
+          <w:szCs w:val="21"/>
+        </w:rPr>
+        <w:t xml:space="preserve">(HR) days.</w:t>
+      </w:r>
+    </w:p>
+    <w:p>
+      <w:pPr>
+        <w:pStyle w:val="ListParagraph"/>
+        <w:numPr>
+          <w:ilvl w:val="0"/>
+          <w:numId w:val="2"/>
+        </w:numPr>
+        <w:spacing w:after="50"/>
+      </w:pPr>
+      <w:r>
+        <w:rPr>
+          <w:rFonts w:ascii="Calibri" w:cs="Calibri" w:eastAsia="Calibri" w:hAnsi="Calibri"/>
+          <w:b/>
+          <w:bCs/>
+          <w:sz w:val="21"/>
+          <w:szCs w:val="21"/>
+        </w:rPr>
+        <w:t xml:space="preserve">Actuarial survivorships</w:t>
+      </w:r>
+      <w:r>
+        <w:rPr>
+          <w:rFonts w:ascii="Calibri" w:cs="Calibri" w:eastAsia="Calibri" w:hAnsi="Calibri"/>
+          <w:sz w:val="21"/>
+          <w:szCs w:val="21"/>
+        </w:rPr>
+        <w:t xml:space="preserve"> (Figure 2b, after Arends et al. 2026, Fig. 1b): for each T-age from 200 to 1,100 d in 15-day steps, the mice alive and under observation at that age (set up by T, died at T or later). For each diet we take the mean age at death minus the mean for both diets, ± s.e.m., and the same quantity predicted by the Gompertz fits.</w:t>
       </w:r>
     </w:p>
     <w:p>
@@ -3064,7 +3144,25 @@
           <w:sz w:val="21"/>
           <w:szCs w:val="21"/>
         </w:rPr>
-        <w:t xml:space="preserve"> (1.29–1.55). The LRT for equal R0 gives p = 7 × 10</w:t>
+        <w:t xml:space="preserve"> (1.29–1.55), or </w:t>
+      </w:r>
+      <w:r>
+        <w:rPr>
+          <w:rFonts w:ascii="Calibri" w:cs="Calibri" w:eastAsia="Calibri" w:hAnsi="Calibri"/>
+          <w:b/>
+          <w:bCs/>
+          <w:sz w:val="21"/>
+          <w:szCs w:val="21"/>
+        </w:rPr>
+        <w:t xml:space="preserve">0.50 doublings</w:t>
+      </w:r>
+      <w:r>
+        <w:rPr>
+          <w:rFonts w:ascii="Calibri" w:cs="Calibri" w:eastAsia="Calibri" w:hAnsi="Calibri"/>
+          <w:sz w:val="21"/>
+          <w:szCs w:val="21"/>
+        </w:rPr>
+        <w:t xml:space="preserve">. The LRT for equal R0 gives p = 7 × 10</w:t>
       </w:r>
       <w:r>
         <w:rPr>
@@ -3238,64 +3336,15 @@
           <w:sz w:val="21"/>
           <w:szCs w:val="21"/>
         </w:rPr>
-        <w:t xml:space="preserve">The a–b ridge:</w:t>
-      </w:r>
-      <w:r>
-        <w:rPr>
-          <w:rFonts w:ascii="Calibri" w:cs="Calibri" w:eastAsia="Calibri" w:hAnsi="Calibri"/>
-          <w:sz w:val="21"/>
-          <w:szCs w:val="21"/>
-        </w:rPr>
-        <w:t xml:space="preserve"> ln </w:t>
-      </w:r>
-      <w:r>
-        <w:rPr>
-          <w:rFonts w:ascii="Calibri" w:cs="Calibri" w:eastAsia="Calibri" w:hAnsi="Calibri"/>
-          <w:i/>
-          <w:iCs/>
-          <w:sz w:val="21"/>
-          <w:szCs w:val="21"/>
-        </w:rPr>
-        <w:t xml:space="preserve">a</w:t>
-      </w:r>
-      <w:r>
-        <w:rPr>
-          <w:rFonts w:ascii="Calibri" w:cs="Calibri" w:eastAsia="Calibri" w:hAnsi="Calibri"/>
-          <w:sz w:val="21"/>
-          <w:szCs w:val="21"/>
-        </w:rPr>
-        <w:t xml:space="preserve"> and ln </w:t>
-      </w:r>
-      <w:r>
-        <w:rPr>
-          <w:rFonts w:ascii="Calibri" w:cs="Calibri" w:eastAsia="Calibri" w:hAnsi="Calibri"/>
-          <w:i/>
-          <w:iCs/>
-          <w:sz w:val="21"/>
-          <w:szCs w:val="21"/>
-        </w:rPr>
-        <w:t xml:space="preserve">b</w:t>
-      </w:r>
-      <w:r>
-        <w:rPr>
-          <w:rFonts w:ascii="Calibri" w:cs="Calibri" w:eastAsia="Calibri" w:hAnsi="Calibri"/>
-          <w:sz w:val="21"/>
-          <w:szCs w:val="21"/>
-        </w:rPr>
-        <w:t xml:space="preserve"> estimates correlate at −0.95 (CD) and −0.97 (HF) across bootstrap fits (Figure 4).</w:t>
-      </w:r>
-    </w:p>
-    <w:p>
-      <w:pPr>
-        <w:pStyle w:val="Heading1"/>
-      </w:pPr>
-      <w:r>
-        <w:rPr>
-          <w:rFonts w:ascii="Calibri" w:cs="Calibri" w:eastAsia="Calibri" w:hAnsi="Calibri"/>
-          <w:sz w:val="26"/>
-          <w:szCs w:val="26"/>
-        </w:rPr>
-        <w:t xml:space="preserve">7. Interpretation and limits</w:t>
+        <w:t xml:space="preserve">The R0–MRDT ridge:</w:t>
+      </w:r>
+      <w:r>
+        <w:rPr>
+          <w:rFonts w:ascii="Calibri" w:cs="Calibri" w:eastAsia="Calibri" w:hAnsi="Calibri"/>
+          <w:sz w:val="21"/>
+          <w:szCs w:val="21"/>
+        </w:rPr>
+        <w:t xml:space="preserve"> R0 and MRDT estimates correlate at 0.95 (CD) and 0.97 (HF) across bootstrap fits (Figure 4).</w:t>
       </w:r>
     </w:p>
     <w:p>
@@ -3315,15 +3364,28 @@
           <w:sz w:val="21"/>
           <w:szCs w:val="21"/>
         </w:rPr>
-        <w:t xml:space="preserve">R0, not slope.</w:t>
-      </w:r>
-      <w:r>
-        <w:rPr>
-          <w:rFonts w:ascii="Calibri" w:cs="Calibri" w:eastAsia="Calibri" w:hAnsi="Calibri"/>
-          <w:sz w:val="21"/>
-          <w:szCs w:val="21"/>
-        </w:rPr>
-        <w:t xml:space="preserve"> The diets differ in R0, not in slope. This holds in five of the six analyses, including with all deaths before 200 d removed.</w:t>
+        <w:t xml:space="preserve">Survivorship gap (Figure 2b):</w:t>
+      </w:r>
+      <w:r>
+        <w:rPr>
+          <w:rFonts w:ascii="Calibri" w:cs="Calibri" w:eastAsia="Calibri" w:hAnsi="Calibri"/>
+          <w:sz w:val="21"/>
+          <w:szCs w:val="21"/>
+        </w:rPr>
+        <w:t xml:space="preserve"> HF survivors die 68 d younger than CD survivors at T200 and 65 d younger at T395. The gap narrows to 52 d at T605, 30 d at T710 and 6 d at T800, then reverses after about T860, with only 56 HF mice left at T860 and 24 at T935. The Gompertz fits predict a gap of 58 d at T200 that narrows only to 26 d at T800 and never reverses.</w:t>
+      </w:r>
+    </w:p>
+    <w:p>
+      <w:pPr>
+        <w:pStyle w:val="Heading1"/>
+      </w:pPr>
+      <w:r>
+        <w:rPr>
+          <w:rFonts w:ascii="Calibri" w:cs="Calibri" w:eastAsia="Calibri" w:hAnsi="Calibri"/>
+          <w:sz w:val="26"/>
+          <w:szCs w:val="26"/>
+        </w:rPr>
+        <w:t xml:space="preserve">7. Interpretation and limits</w:t>
       </w:r>
     </w:p>
     <w:p>
@@ -3343,6 +3405,34 @@
           <w:sz w:val="21"/>
           <w:szCs w:val="21"/>
         </w:rPr>
+        <w:t xml:space="preserve">R0, not slope.</w:t>
+      </w:r>
+      <w:r>
+        <w:rPr>
+          <w:rFonts w:ascii="Calibri" w:cs="Calibri" w:eastAsia="Calibri" w:hAnsi="Calibri"/>
+          <w:sz w:val="21"/>
+          <w:szCs w:val="21"/>
+        </w:rPr>
+        <w:t xml:space="preserve"> The diets differ in R0, not in slope. This holds in five of the six analyses, including with all deaths before 200 d removed.</w:t>
+      </w:r>
+    </w:p>
+    <w:p>
+      <w:pPr>
+        <w:pStyle w:val="ListParagraph"/>
+        <w:numPr>
+          <w:ilvl w:val="0"/>
+          <w:numId w:val="2"/>
+        </w:numPr>
+        <w:spacing w:after="50"/>
+      </w:pPr>
+      <w:r>
+        <w:rPr>
+          <w:rFonts w:ascii="Calibri" w:cs="Calibri" w:eastAsia="Calibri" w:hAnsi="Calibri"/>
+          <w:b/>
+          <w:bCs/>
+          <w:sz w:val="21"/>
+          <w:szCs w:val="21"/>
+        </w:rPr>
         <w:t xml:space="preserve">One analysis disagrees.</w:t>
       </w:r>
       <w:r>
@@ -3369,43 +3459,7 @@
           <w:sz w:val="21"/>
           <w:szCs w:val="21"/>
         </w:rPr>
-        <w:t xml:space="preserve">Two explanations are possible: population heterogeneity (a higher hazard removes frail mice sooner and flattens the late curve), or the </w:t>
-      </w:r>
-      <w:r>
-        <w:rPr>
-          <w:rFonts w:ascii="Calibri" w:cs="Calibri" w:eastAsia="Calibri" w:hAnsi="Calibri"/>
-          <w:i/>
-          <w:iCs/>
-          <w:sz w:val="21"/>
-          <w:szCs w:val="21"/>
-        </w:rPr>
-        <w:t xml:space="preserve">a</w:t>
-      </w:r>
-      <w:r>
-        <w:rPr>
-          <w:rFonts w:ascii="Calibri" w:cs="Calibri" w:eastAsia="Calibri" w:hAnsi="Calibri"/>
-          <w:sz w:val="21"/>
-          <w:szCs w:val="21"/>
-        </w:rPr>
-        <w:t xml:space="preserve">–</w:t>
-      </w:r>
-      <w:r>
-        <w:rPr>
-          <w:rFonts w:ascii="Calibri" w:cs="Calibri" w:eastAsia="Calibri" w:hAnsi="Calibri"/>
-          <w:i/>
-          <w:iCs/>
-          <w:sz w:val="21"/>
-          <w:szCs w:val="21"/>
-        </w:rPr>
-        <w:t xml:space="preserve">b</w:t>
-      </w:r>
-      <w:r>
-        <w:rPr>
-          <w:rFonts w:ascii="Calibri" w:cs="Calibri" w:eastAsia="Calibri" w:hAnsi="Calibri"/>
-          <w:sz w:val="21"/>
-          <w:szCs w:val="21"/>
-        </w:rPr>
-        <w:t xml:space="preserve"> ridge. The Gompertz curve fits HF less well than CD (Figure 2).</w:t>
+        <w:t xml:space="preserve">Two explanations are possible: population heterogeneity (a higher hazard removes frail mice sooner and flattens the late curve), or the R0–MRDT ridge.</w:t>
       </w:r>
     </w:p>
     <w:p>
@@ -3425,15 +3479,15 @@
           <w:sz w:val="21"/>
           <w:szCs w:val="21"/>
         </w:rPr>
-        <w:t xml:space="preserve">This is the MRDT of a mixture of 124 genotypes.</w:t>
-      </w:r>
-      <w:r>
-        <w:rPr>
-          <w:rFonts w:ascii="Calibri" w:cs="Calibri" w:eastAsia="Calibri" w:hAnsi="Calibri"/>
-          <w:sz w:val="21"/>
-          <w:szCs w:val="21"/>
-        </w:rPr>
-        <w:t xml:space="preserve"> Pooling flattens the population curve and dilutes the diet effect: the HR is 1.44 pooled against 1.78 within strains. Roy et al. 2021 report 2.0.</w:t>
+        <w:t xml:space="preserve">Figure 2b shows where it happens.</w:t>
+      </w:r>
+      <w:r>
+        <w:rPr>
+          <w:rFonts w:ascii="Calibri" w:cs="Calibri" w:eastAsia="Calibri" w:hAnsi="Calibri"/>
+          <w:sz w:val="21"/>
+          <w:szCs w:val="21"/>
+        </w:rPr>
+        <w:t xml:space="preserve"> The diet gap closes between about 650 and 850 d, much faster than a constant 1.42-fold hazard predicts, and reverses afterwards. Selective loss of frail HF mice would produce this pattern, and it is the same signal as the shallower HF slope after 365 d.</w:t>
       </w:r>
     </w:p>
     <w:p>
@@ -3453,15 +3507,15 @@
           <w:sz w:val="21"/>
           <w:szCs w:val="21"/>
         </w:rPr>
-        <w:t xml:space="preserve">Not yet adjusted</w:t>
-      </w:r>
-      <w:r>
-        <w:rPr>
-          <w:rFonts w:ascii="Calibri" w:cs="Calibri" w:eastAsia="Calibri" w:hAnsi="Calibri"/>
-          <w:sz w:val="21"/>
-          <w:szCs w:val="21"/>
-        </w:rPr>
-        <w:t xml:space="preserve"> for vivarium (vivarium 3: 440 CD, 232 HF) or cohort. Animals still alive when the file was made are absent, which affects only the latest cohorts.</w:t>
+        <w:t xml:space="preserve">This is the MRDT of a mixture of 124 genotypes.</w:t>
+      </w:r>
+      <w:r>
+        <w:rPr>
+          <w:rFonts w:ascii="Calibri" w:cs="Calibri" w:eastAsia="Calibri" w:hAnsi="Calibri"/>
+          <w:sz w:val="21"/>
+          <w:szCs w:val="21"/>
+        </w:rPr>
+        <w:t xml:space="preserve"> Pooling flattens the population curve and dilutes the diet effect: the HR is 1.44 pooled against 1.78 within strains. Roy et al. 2021 report 2.0.</w:t>
       </w:r>
     </w:p>
     <w:p>
@@ -3481,25 +3535,43 @@
           <w:sz w:val="21"/>
           <w:szCs w:val="21"/>
         </w:rPr>
-        <w:t xml:space="preserve">Next steps:</w:t>
+        <w:t xml:space="preserve">Not yet adjusted</w:t>
+      </w:r>
+      <w:r>
+        <w:rPr>
+          <w:rFonts w:ascii="Calibri" w:cs="Calibri" w:eastAsia="Calibri" w:hAnsi="Calibri"/>
+          <w:sz w:val="21"/>
+          <w:szCs w:val="21"/>
+        </w:rPr>
+        <w:t xml:space="preserve"> for vivarium (vivarium 3: 440 CD, 232 HF) or cohort. Animals still alive when the file was made are absent, which affects only the latest cohorts.</w:t>
       </w:r>
     </w:p>
     <w:p>
       <w:pPr>
         <w:pStyle w:val="ListParagraph"/>
         <w:numPr>
-          <w:ilvl w:val="1"/>
+          <w:ilvl w:val="0"/>
           <w:numId w:val="2"/>
         </w:numPr>
-        <w:spacing w:after="40"/>
-      </w:pPr>
-      <w:r>
-        <w:rPr>
-          <w:rFonts w:ascii="Calibri" w:cs="Calibri" w:eastAsia="Calibri" w:hAnsi="Calibri"/>
-          <w:sz w:val="21"/>
-          <w:szCs w:val="21"/>
-        </w:rPr>
-        <w:t xml:space="preserve">Per-strain or per-type </w:t>
+        <w:spacing w:after="50"/>
+      </w:pPr>
+      <w:r>
+        <w:rPr>
+          <w:rFonts w:ascii="Calibri" w:cs="Calibri" w:eastAsia="Calibri" w:hAnsi="Calibri"/>
+          <w:b/>
+          <w:bCs/>
+          <w:sz w:val="21"/>
+          <w:szCs w:val="21"/>
+        </w:rPr>
+        <w:t xml:space="preserve">Next steps:</w:t>
+      </w:r>
+      <w:r>
+        <w:rPr>
+          <w:rFonts w:ascii="Calibri" w:cs="Calibri" w:eastAsia="Calibri" w:hAnsi="Calibri"/>
+          <w:sz w:val="21"/>
+          <w:szCs w:val="21"/>
+        </w:rPr>
+        <w:t xml:space="preserve"> per-strain or per-type </w:t>
       </w:r>
       <w:r>
         <w:rPr>
@@ -3535,66 +3607,13 @@
           <w:sz w:val="21"/>
           <w:szCs w:val="21"/>
         </w:rPr>
-        <w:t xml:space="preserve">, with shrinkage.</w:t>
-      </w:r>
-    </w:p>
-    <w:p>
-      <w:pPr>
-        <w:pStyle w:val="ListParagraph"/>
-        <w:numPr>
-          <w:ilvl w:val="1"/>
-          <w:numId w:val="2"/>
-        </w:numPr>
-        <w:spacing w:after="40"/>
-      </w:pPr>
-      <w:r>
-        <w:rPr>
-          <w:rFonts w:ascii="Calibri" w:cs="Calibri" w:eastAsia="Calibri" w:hAnsi="Calibri"/>
-          <w:sz w:val="21"/>
-          <w:szCs w:val="21"/>
-        </w:rPr>
-        <w:t xml:space="preserve">A gamma-Gompertz (frailty) model.</w:t>
-      </w:r>
-    </w:p>
-    <w:p>
-      <w:pPr>
-        <w:pStyle w:val="ListParagraph"/>
-        <w:numPr>
-          <w:ilvl w:val="1"/>
-          <w:numId w:val="2"/>
-        </w:numPr>
-        <w:spacing w:after="40"/>
-      </w:pPr>
-      <w:r>
-        <w:rPr>
-          <w:rFonts w:ascii="Calibri" w:cs="Calibri" w:eastAsia="Calibri" w:hAnsi="Calibri"/>
-          <w:sz w:val="21"/>
-          <w:szCs w:val="21"/>
-        </w:rPr>
-        <w:t xml:space="preserve">Vivarium as a covariate.</w:t>
-      </w:r>
-    </w:p>
-    <w:p>
-      <w:pPr>
-        <w:pStyle w:val="ListParagraph"/>
-        <w:numPr>
-          <w:ilvl w:val="1"/>
-          <w:numId w:val="2"/>
-        </w:numPr>
-        <w:spacing w:after="40"/>
-      </w:pPr>
-      <w:r>
-        <w:rPr>
-          <w:rFonts w:ascii="Calibri" w:cs="Calibri" w:eastAsia="Calibri" w:hAnsi="Calibri"/>
-          <w:sz w:val="21"/>
-          <w:szCs w:val="21"/>
-        </w:rPr>
-        <w:t xml:space="preserve">A rerun on the approved data set.</w:t>
+        <w:t xml:space="preserve"> with shrinkage; a gamma-Gompertz (frailty) model; vivarium as a covariate; a rerun on the approved data set.</w:t>
       </w:r>
     </w:p>
     <w:p>
       <w:pPr>
         <w:pStyle w:val="Heading1"/>
+        <w:pageBreakBefore/>
       </w:pPr>
       <w:r>
         <w:rPr>
@@ -3607,7 +3626,7 @@
     </w:p>
     <w:p>
       <w:pPr>
-        <w:spacing w:after="100"/>
+        <w:spacing w:after="140"/>
       </w:pPr>
       <w:r>
         <w:rPr>
@@ -3625,35 +3644,35 @@
           <w:sz w:val="21"/>
           <w:szCs w:val="21"/>
         </w:rPr>
-        <w:t xml:space="preserve"> Mortality rate (deaths per 1,000 mouse-days, log scale) against age for chow-fed (CD, blue, n = 1,044) and high-fat-fed (HF, orange, n = 890) BXD family females. Points are occurrence/exposure rates in 30-day age intervals: deaths in the interval divided by mouse-days at risk, each mouse counted from its age at set up. Intervals are shown where at least 20 mice were at risk; point diameter grows with the square root of the number of deaths. Lines are Gompertz fits by maximum likelihood, left-truncated at set-up age, drawn from 100 to 1,250 d. The key gives each diet's MRDT with its 95% Wald interval. The slopes do not differ (likelihood-ratio test, p = 0.55). With a shared slope (MRDT 151 d), HF mortality is 1.42 times CD mortality at every age (95% CI 1.29–1.55).</w:t>
-      </w:r>
-    </w:p>
-    <w:p>
-      <w:pPr>
-        <w:spacing w:after="100"/>
-      </w:pPr>
-      <w:r>
-        <w:rPr>
-          <w:rFonts w:ascii="Calibri" w:cs="Calibri" w:eastAsia="Calibri" w:hAnsi="Calibri"/>
-          <w:b/>
-          <w:bCs/>
-          <w:sz w:val="21"/>
-          <w:szCs w:val="21"/>
-        </w:rPr>
-        <w:t xml:space="preserve">Figure 2. Survival from 200 days.</w:t>
-      </w:r>
-      <w:r>
-        <w:rPr>
-          <w:rFonts w:ascii="Calibri" w:cs="Calibri" w:eastAsia="Calibri" w:hAnsi="Calibri"/>
-          <w:sz w:val="21"/>
-          <w:szCs w:val="21"/>
-        </w:rPr>
-        <w:t xml:space="preserve"> Kaplan–Meier survival (solid lines) of mice alive at 200 d (CD n = 1,018, HF n = 865), each at risk from the later of its set-up age and 200 d. Dashed lines show survival predicted by the primary Gompertz fits (Figure 1), conditional on survival to 200 d. Labels give median age at death among these mice. The Gompertz curve fits CD closely; for HF, observed mortality is higher than predicted from about 600 to 850 d and lower after that.</w:t>
-      </w:r>
-    </w:p>
-    <w:p>
-      <w:pPr>
-        <w:spacing w:after="100"/>
+        <w:t xml:space="preserve"> Mortality rate against age for chow-fed (CD, blue, n = 1,044) and high-fat-fed (HF, orange, n = 890) BXD family females. The y axis is deaths per 1,000 mouse-days on a log2 scale, so each gridline marks one doubling. Points are occurrence/exposure rates in 30-day age intervals: deaths in the interval divided by mouse-days at risk, each mouse counted from its age at set up. Intervals are shown where at least 20 mice were at risk; point diameter grows with the square root of the number of deaths. Lines are Gompertz fits by maximum likelihood, left-truncated at set-up age, drawn from 100 to 1,250 d. The key gives each diet's MRDT with its 95% Wald interval. The slopes do not differ (likelihood-ratio test, p = 0.55). With a shared slope (MRDT 151 d), HF mortality is 1.42 times CD mortality at every age (95% CI 1.29–1.55), which is 0.50 doublings higher.</w:t>
+      </w:r>
+    </w:p>
+    <w:p>
+      <w:pPr>
+        <w:spacing w:after="140"/>
+      </w:pPr>
+      <w:r>
+        <w:rPr>
+          <w:rFonts w:ascii="Calibri" w:cs="Calibri" w:eastAsia="Calibri" w:hAnsi="Calibri"/>
+          <w:b/>
+          <w:bCs/>
+          <w:sz w:val="21"/>
+          <w:szCs w:val="21"/>
+        </w:rPr>
+        <w:t xml:space="preserve">Figure 2. Survival from 200 days (a) and the diet gap by T-age (b).</w:t>
+      </w:r>
+      <w:r>
+        <w:rPr>
+          <w:rFonts w:ascii="Calibri" w:cs="Calibri" w:eastAsia="Calibri" w:hAnsi="Calibri"/>
+          <w:sz w:val="21"/>
+          <w:szCs w:val="21"/>
+        </w:rPr>
+        <w:t xml:space="preserve"> (a) Kaplan–Meier survival (solid lines) of mice alive at 200 d (CD n = 1,018, HF n = 865), each at risk from the later of its set-up age and 200 d. Dashed lines show survival predicted by the primary Gompertz fits (Figure 1), conditional on survival to 200 d. Labels give median age at death among these mice. (b) The same data as actuarial survivorships, in the style of Arends et al. 2026, Fig. 1b. Each survivorship is the set of mice alive and under observation at a given T-age, that is, set up by that age and dying at or after it, in 15-day steps from 200 d. Solid lines show each diet's mean age at death minus the mean for both diets, with ±1 s.e.m. bands. Lines are drawn while both diets keep at least 20 mice (to 935 d); numbers along the top give mice alive (CD / HF). Dashed lines show the same quantity predicted by the Gompertz fits. HF survivors die 65 to 69 d younger than CD survivors through 400 d. The gap closes between about 650 and 850 d, faster than the Gompertz fits predict, and reverses after about 860 d, when few HF mice remain.</w:t>
+      </w:r>
+    </w:p>
+    <w:p>
+      <w:pPr>
+        <w:spacing w:after="140"/>
       </w:pPr>
       <w:r>
         <w:rPr>
@@ -3671,30 +3690,30 @@
           <w:sz w:val="21"/>
           <w:szCs w:val="21"/>
         </w:rPr>
-        <w:t xml:space="preserve"> Mortality rate doubling time (days) for CD (blue) and HF (orange) under the primary analysis and five alternatives (rows; definitions in section 5). Points are estimates and bars are 95% intervals. The intervals are Wald intervals on the ln b scale, except in two rows: the bootstrap row uses the 2.5th and 97.5th percentiles of 2,000 resamples, and the binned-regression row uses the regression standard error of the slope. At right is the likelihood-ratio p value for equal slopes in the four analyses where it was computed. Only the analysis restricted to mice surviving to 365 d gives a nominally different slope (p = 0.035).</w:t>
-      </w:r>
-    </w:p>
-    <w:p>
-      <w:pPr>
-        <w:spacing w:after="100"/>
-      </w:pPr>
-      <w:r>
-        <w:rPr>
-          <w:rFonts w:ascii="Calibri" w:cs="Calibri" w:eastAsia="Calibri" w:hAnsi="Calibri"/>
-          <w:b/>
-          <w:bCs/>
-          <w:sz w:val="21"/>
-          <w:szCs w:val="21"/>
-        </w:rPr>
-        <w:t xml:space="preserve">Figure 4. Intercept and slope estimates trade off along a ridge.</w:t>
-      </w:r>
-      <w:r>
-        <w:rPr>
-          <w:rFonts w:ascii="Calibri" w:cs="Calibri" w:eastAsia="Calibri" w:hAnsi="Calibri"/>
-          <w:sz w:val="21"/>
-          <w:szCs w:val="21"/>
-        </w:rPr>
-        <w:t xml:space="preserve"> Each small point is one of 2,000 bootstrap fits per diet (mice resampled with replacement within diet), plotting ln(R0) = ln(a) against MRDT. Large points are the estimates from the full data. Within each diet the estimates lie on a narrow diagonal ridge: ln(a) and ln(b) correlate at −0.95 (CD) and −0.97 (HF), the Strehler–Mildvan degeneracy of the Gompertz fit. The two ridges overlap in MRDT but are separated along ln(R0), showing that the diets differ in age-independent mortality, not in the rate of aging. Because of the ridge, slopes should be compared with the joint likelihood-ratio test rather than by comparing separate intervals.</w:t>
+        <w:t xml:space="preserve"> Mortality rate doubling time (days) for CD (blue) and HF (orange) under the primary analysis and five alternatives (rows; definitions in section 5). Points are estimates and bars are 95% intervals. The intervals are Wald intervals on the log scale of the slope, except in two rows: the bootstrap row uses the 2.5th and 97.5th percentiles of 2,000 resamples, and the binned-regression row uses the regression standard error of the slope. At right is the likelihood-ratio p value for equal slopes in the four analyses where it was computed. Only the analysis restricted to mice surviving to 365 d gives a nominally different slope (p = 0.035).</w:t>
+      </w:r>
+    </w:p>
+    <w:p>
+      <w:pPr>
+        <w:spacing w:after="140"/>
+      </w:pPr>
+      <w:r>
+        <w:rPr>
+          <w:rFonts w:ascii="Calibri" w:cs="Calibri" w:eastAsia="Calibri" w:hAnsi="Calibri"/>
+          <w:b/>
+          <w:bCs/>
+          <w:sz w:val="21"/>
+          <w:szCs w:val="21"/>
+        </w:rPr>
+        <w:t xml:space="preserve">Figure 4. R0 and MRDT estimates trade off along a ridge.</w:t>
+      </w:r>
+      <w:r>
+        <w:rPr>
+          <w:rFonts w:ascii="Calibri" w:cs="Calibri" w:eastAsia="Calibri" w:hAnsi="Calibri"/>
+          <w:sz w:val="21"/>
+          <w:szCs w:val="21"/>
+        </w:rPr>
+        <w:t xml:space="preserve"> Each small point is one of 2,000 bootstrap fits per diet (mice resampled with replacement within diet), plotting R0 against MRDT. R0 is deaths per 1,000 mouse-days at age 0, on a log2 scale. Large points are the estimates from the full data. Within each diet the estimates lie on a narrow diagonal ridge: R0 and MRDT estimates correlate at 0.95 (CD) and 0.97 (HF), the Strehler–Mildvan degeneracy of the Gompertz fit. The two ridges overlap in MRDT but are separated along R0, showing that the diets differ in age-independent mortality, not in the rate of aging. Because of the ridge, slopes should be compared with the joint likelihood-ratio test rather than by comparing separate intervals.</w:t>
       </w:r>
     </w:p>
     <w:p>

</xml_diff>

<commit_message>
Recolor diets (chow brown, high fat blue); darker shading in Fig 2b
The high-fat diet is known as the blue diet, so HF is now blue and
chow a chow-like brown (#a86a28; the pair passes the contrast and
color-blind checks). Fig 2b uses 50% shading for the s.e.m. bands, as
in Arends et al. 2026, with all bands drawn before the lines.
Legends and overview updated.

Co-Authored-By: Claude Opus 5.5 <noreply@anthropic.com>
Claude-Session: https://claude.ai/code/session_01LjVRTysfiRrxMNqEy9eJRa
</commit_message>
<xml_diff>
--- a/notes/Overview_MRDT_diet_initial.docx
+++ b/notes/Overview_MRDT_diet_initial.docx
@@ -3644,7 +3644,7 @@
           <w:sz w:val="21"/>
           <w:szCs w:val="21"/>
         </w:rPr>
-        <w:t xml:space="preserve"> Mortality rate against age for chow-fed (CD, blue, n = 1,044) and high-fat-fed (HF, orange, n = 890) BXD family females. The y axis is deaths per 1,000 mouse-days on a log2 scale, so each gridline marks one doubling. Points are occurrence/exposure rates in 30-day age intervals: deaths in the interval divided by mouse-days at risk, each mouse counted from its age at set up. Intervals are shown where at least 20 mice were at risk; point diameter grows with the square root of the number of deaths. Lines are Gompertz fits by maximum likelihood, left-truncated at set-up age, drawn from 100 to 1,250 d. The key gives each diet's MRDT with its 95% Wald interval. The slopes do not differ (likelihood-ratio test, p = 0.55). With a shared slope (MRDT 151 d), HF mortality is 1.42 times CD mortality at every age (95% CI 1.29–1.55), which is 0.50 doublings higher.</w:t>
+        <w:t xml:space="preserve"> Mortality rate against age for chow-fed (CD, brown, n = 1,044) and high-fat-fed (HF, blue, n = 890) BXD family females. The y axis is deaths per 1,000 mouse-days on a log2 scale, so each gridline marks one doubling. Points are occurrence/exposure rates in 30-day age intervals: deaths in the interval divided by mouse-days at risk, each mouse counted from its age at set up. Intervals are shown where at least 20 mice were at risk; point diameter grows with the square root of the number of deaths. Lines are Gompertz fits by maximum likelihood, left-truncated at set-up age, drawn from 100 to 1,250 d. The key gives each diet's MRDT with its 95% Wald interval. The slopes do not differ (likelihood-ratio test, p = 0.55). With a shared slope (MRDT 151 d), HF mortality is 1.42 times CD mortality at every age (95% CI 1.29–1.55), which is 0.50 doublings higher.</w:t>
       </w:r>
     </w:p>
     <w:p>
@@ -3690,7 +3690,7 @@
           <w:sz w:val="21"/>
           <w:szCs w:val="21"/>
         </w:rPr>
-        <w:t xml:space="preserve"> Mortality rate doubling time (days) for CD (blue) and HF (orange) under the primary analysis and five alternatives (rows; definitions in section 5). Points are estimates and bars are 95% intervals. The intervals are Wald intervals on the log scale of the slope, except in two rows: the bootstrap row uses the 2.5th and 97.5th percentiles of 2,000 resamples, and the binned-regression row uses the regression standard error of the slope. At right is the likelihood-ratio p value for equal slopes in the four analyses where it was computed. Only the analysis restricted to mice surviving to 365 d gives a nominally different slope (p = 0.035).</w:t>
+        <w:t xml:space="preserve"> Mortality rate doubling time (days) for CD (brown) and HF (blue) under the primary analysis and five alternatives (rows; definitions in section 5). Points are estimates and bars are 95% intervals. The intervals are Wald intervals on the log scale of the slope, except in two rows: the bootstrap row uses the 2.5th and 97.5th percentiles of 2,000 resamples, and the binned-regression row uses the regression standard error of the slope. At right is the likelihood-ratio p value for equal slopes in the four analyses where it was computed. Only the analysis restricted to mice surviving to 365 d gives a nominally different slope (p = 0.035).</w:t>
       </w:r>
     </w:p>
     <w:p>

</xml_diff>

<commit_message>
Nature-style legends and figure conventions
Legends rewritten in the style of Arends et al. 2026 (bold "Fig. N |"
titles stating the finding, lowercase panel letters, error bars and n
defined, tests named, capital P). Figures use capital P. New
notes/figure_style.md records the Nature figure and legend conventions
to apply when the final multi-panel figures are assembled.

Co-Authored-By: Claude Opus 5.5 <noreply@anthropic.com>
Claude-Session: https://claude.ai/code/session_01LjVRTysfiRrxMNqEy9eJRa
</commit_message>
<xml_diff>
--- a/notes/Overview_MRDT_diet_initial.docx
+++ b/notes/Overview_MRDT_diet_initial.docx
@@ -3636,15 +3636,15 @@
           <w:sz w:val="21"/>
           <w:szCs w:val="21"/>
         </w:rPr>
-        <w:t xml:space="preserve">Figure 1. Mortality rises in parallel on chow and high-fat diets.</w:t>
-      </w:r>
-      <w:r>
-        <w:rPr>
-          <w:rFonts w:ascii="Calibri" w:cs="Calibri" w:eastAsia="Calibri" w:hAnsi="Calibri"/>
-          <w:sz w:val="21"/>
-          <w:szCs w:val="21"/>
-        </w:rPr>
-        <w:t xml:space="preserve"> Mortality rate against age for chow-fed (CD, brown, n = 1,044) and high-fat-fed (HF, blue, n = 890) BXD family females. The y axis is deaths per 1,000 mouse-days on a log2 scale, so each gridline marks one doubling. Points are occurrence/exposure rates in 30-day age intervals: deaths in the interval divided by mouse-days at risk, each mouse counted from its age at set up. Intervals are shown where at least 20 mice were at risk; point diameter grows with the square root of the number of deaths. Lines are Gompertz fits by maximum likelihood, left-truncated at set-up age, drawn over the ages covered by the plotted intervals. The key gives each diet's MRDT with its 95% Wald interval. The slopes do not differ (likelihood-ratio test, p = 0.55). With a shared slope (MRDT 151 d), HF mortality is 1.42 times CD mortality at every age (95% CI 1.29–1.55), which is 0.50 doublings higher.</w:t>
+        <w:t xml:space="preserve">Fig. 1 | A high-fat diet raises mortality at every age without changing the mortality rate doubling time.</w:t>
+      </w:r>
+      <w:r>
+        <w:rPr>
+          <w:rFonts w:ascii="Calibri" w:cs="Calibri" w:eastAsia="Calibri" w:hAnsi="Calibri"/>
+          <w:sz w:val="21"/>
+          <w:szCs w:val="21"/>
+        </w:rPr>
+        <w:t xml:space="preserve"> Mortality rates of BXD family females fed chow (CD, brown; n = 1,044) or a high-fat diet (HF, blue; n = 890) as a function of age. Points show occurrence/exposure rates in 30-day intervals: deaths per 1,000 mouse-days at risk, with each mouse at risk from its age at set-up. Intervals are shown where at least 20 mice were at risk; point diameter scales with the square root of the number of deaths. Lines show maximum-likelihood Gompertz fits, left-truncated at set-up age and drawn over the ages covered by the data. The y axis is log2-scaled, so each gridline marks one doubling of mortality. The key gives the mortality rate doubling time (MRDT) with 95% Wald confidence intervals (CI). Slopes do not differ between diets (likelihood-ratio test, P = 0.55). With a shared slope (MRDT 151 days), HF mortality is 1.42-fold that of CD (95% CI 1.29–1.55), or 0.50 doublings higher, at every age.</w:t>
       </w:r>
     </w:p>
     <w:p>
@@ -3659,15 +3659,15 @@
           <w:sz w:val="21"/>
           <w:szCs w:val="21"/>
         </w:rPr>
-        <w:t xml:space="preserve">Figure 2. Survival from 200 days (a) and the diet gap by T-age (b).</w:t>
-      </w:r>
-      <w:r>
-        <w:rPr>
-          <w:rFonts w:ascii="Calibri" w:cs="Calibri" w:eastAsia="Calibri" w:hAnsi="Calibri"/>
-          <w:sz w:val="21"/>
-          <w:szCs w:val="21"/>
-        </w:rPr>
-        <w:t xml:space="preserve"> (a) Kaplan–Meier survival (solid lines) of mice alive at 200 d (CD n = 1,018, HF n = 865), each at risk from the later of its set-up age and 200 d. Dashed lines show survival predicted by the primary Gompertz fits (Figure 1), conditional on survival to 200 d. Labels give median age at death among these mice. (b) The same data as actuarial survivorships, in the style of Arends et al. 2026, Fig. 1b. Each survivorship is the set of mice alive and under observation at a given T-age, that is, set up by that age and dying at or after it, in 15-day steps from 200 d. Lines show each diet's mean age at death minus the mean for both diets; shading shows ±1 s.e.m. Lines are drawn while both diets keep at least 20 mice (to 935 d); numbers along the top give mice alive (CD / HF). HF survivors die 65 to 69 d younger than CD survivors through 400 d. The gap closes between about 650 and 850 d, faster than the Gompertz fits predict (section 6), and reverses after about 860 d, when few HF mice remain.</w:t>
+        <w:t xml:space="preserve">Fig. 2 | Survival and actuarial survivorships by diet.</w:t>
+      </w:r>
+      <w:r>
+        <w:rPr>
+          <w:rFonts w:ascii="Calibri" w:cs="Calibri" w:eastAsia="Calibri" w:hAnsi="Calibri"/>
+          <w:sz w:val="21"/>
+          <w:szCs w:val="21"/>
+        </w:rPr>
+        <w:t xml:space="preserve"> a, Kaplan–Meier survival of mice alive at 200 days (CD n = 1,018; HF n = 865), each at risk from the later of its set-up age and 200 days. Dashed lines show survival predicted by the Gompertz fits in Fig. 1, conditional on survival to 200 days; median ages at death are given for each diet. b, Mean age at death of each diet's survivorship relative to both diets combined, as a function of the minimum inclusion age (T-age), in 15-day steps (Arends et al. 2026, Fig. 1b). Each survivorship includes the mice alive and under observation at that T-age. Lines indicate mean and shaded bands represent s.e.m. Lines end where either diet falls below 20 mice (T935); numbers at top give mice alive (CD / HF). HF survivors die 65–69 days earlier than CD survivors up to T400. The difference narrows between T650 and T850, faster than the Gompertz fits predict, and reverses after T860, when few HF mice remain.</w:t>
       </w:r>
     </w:p>
     <w:p>
@@ -3682,15 +3682,15 @@
           <w:sz w:val="21"/>
           <w:szCs w:val="21"/>
         </w:rPr>
-        <w:t xml:space="preserve">Figure 3. MRDT is robust to the choice of analysis.</w:t>
-      </w:r>
-      <w:r>
-        <w:rPr>
-          <w:rFonts w:ascii="Calibri" w:cs="Calibri" w:eastAsia="Calibri" w:hAnsi="Calibri"/>
-          <w:sz w:val="21"/>
-          <w:szCs w:val="21"/>
-        </w:rPr>
-        <w:t xml:space="preserve"> Mortality rate doubling time (days) for CD (brown) and HF (blue) under the primary analysis and five alternatives (rows; definitions in section 5). Points are estimates and bars are 95% intervals. The intervals are Wald intervals on the log scale of the slope, except in two rows: the bootstrap row uses the 2.5th and 97.5th percentiles of 2,000 resamples, and the binned-regression row uses the regression standard error of the slope. At right is the likelihood-ratio p value for equal slopes in the four analyses where it was computed. Only the analysis restricted to mice surviving to 365 d gives a nominally different slope (p = 0.035).</w:t>
+        <w:t xml:space="preserve">Fig. 3 | Estimates of the mortality rate doubling time are robust to analytical choices.</w:t>
+      </w:r>
+      <w:r>
+        <w:rPr>
+          <w:rFonts w:ascii="Calibri" w:cs="Calibri" w:eastAsia="Calibri" w:hAnsi="Calibri"/>
+          <w:sz w:val="21"/>
+          <w:szCs w:val="21"/>
+        </w:rPr>
+        <w:t xml:space="preserve"> MRDT (days) for CD (brown) and HF (blue) in the primary analysis and five alternatives (Methods). Points indicate estimates and bars indicate 95% CI: Wald intervals on the log scale of the slope, except in the bootstrap row (2.5th to 97.5th percentiles of 2,000 resamples) and the binned-regression row (regression standard error). P values at right are from likelihood-ratio tests of equal slopes. Only the subset of mice surviving to 365 days gives a nominally different slope (P = 0.035, uncorrected for the four tests).</w:t>
       </w:r>
     </w:p>
     <w:p>
@@ -3705,15 +3705,15 @@
           <w:sz w:val="21"/>
           <w:szCs w:val="21"/>
         </w:rPr>
-        <w:t xml:space="preserve">Figure 4. R0 and MRDT estimates trade off along a ridge.</w:t>
-      </w:r>
-      <w:r>
-        <w:rPr>
-          <w:rFonts w:ascii="Calibri" w:cs="Calibri" w:eastAsia="Calibri" w:hAnsi="Calibri"/>
-          <w:sz w:val="21"/>
-          <w:szCs w:val="21"/>
-        </w:rPr>
-        <w:t xml:space="preserve"> Each small point is one of 2,000 bootstrap fits per diet (mice resampled with replacement within diet), plotting R0 against MRDT. R0 is deaths per 1,000 mouse-days at age 0, on a log2 scale. Large points are the estimates from the full data. Within each diet the estimates lie on a narrow diagonal ridge: R0 and MRDT estimates correlate at 0.95 (CD) and 0.97 (HF), the Strehler–Mildvan degeneracy of the Gompertz fit. The two ridges overlap in MRDT but are separated along R0, showing that the diets differ in age-independent mortality, not in the rate of aging. Because of the ridge, slopes should be compared with the joint likelihood-ratio test rather than by comparing separate intervals.</w:t>
+        <w:t xml:space="preserve">Fig. 4 | Estimates of R0 and the mortality rate doubling time are tightly coupled.</w:t>
+      </w:r>
+      <w:r>
+        <w:rPr>
+          <w:rFonts w:ascii="Calibri" w:cs="Calibri" w:eastAsia="Calibri" w:hAnsi="Calibri"/>
+          <w:sz w:val="21"/>
+          <w:szCs w:val="21"/>
+        </w:rPr>
+        <w:t xml:space="preserve"> Each small point is one of 2,000 bootstrap fits per diet, with mice resampled with replacement within diet; large points are full-data estimates. R0 is the age-independent mortality, in deaths per 1,000 mouse-days at age 0 (log2 scale). Estimates of R0 and MRDT correlate at r = 0.95 (CD) and r = 0.97 (HF), the Strehler–Mildvan degeneracy of the Gompertz fit. The two diets overlap in MRDT and separate along R0. Slopes should therefore be compared with joint likelihood-ratio tests rather than by comparing separate intervals.</w:t>
       </w:r>
     </w:p>
     <w:p>

</xml_diff>